<commit_message>
Neural network and comparasion with SVM
</commit_message>
<xml_diff>
--- a/Task_3/Model output analysis.docx
+++ b/Task_3/Model output analysis.docx
@@ -22,18 +22,7 @@
           <w:szCs w:val="36"/>
           <w:lang w:val="en-US"/>
         </w:rPr>
-        <w:t>Deep learning</w:t>
-      </w:r>
-      <w:r>
-        <w:rPr>
-          <w:rFonts w:ascii="Times New Roman" w:hAnsi="Times New Roman" w:cs="Times New Roman"/>
-          <w:b/>
-          <w:bCs/>
-          <w:sz w:val="36"/>
-          <w:szCs w:val="36"/>
-          <w:lang w:val="en-US"/>
-        </w:rPr>
-        <w:t xml:space="preserve"> output analysis</w:t>
+        <w:t>Deep learning output analysis</w:t>
       </w:r>
     </w:p>
     <w:p>
@@ -45,16 +34,13 @@
       </w:pPr>
       <w:r>
         <w:rPr>
-          <w:rFonts w:ascii="Times New Roman" w:hAnsi="Times New Roman" w:cs="Times New Roman"/>
-          <w:b/>
-          <w:bCs/>
-          <w:lang w:val="en-US"/>
+          <w:noProof/>
         </w:rPr>
         <w:drawing>
-          <wp:inline distT="0" distB="0" distL="0" distR="0" wp14:anchorId="2D2067B0" wp14:editId="555AD9BB">
+          <wp:inline distT="0" distB="0" distL="0" distR="0" wp14:anchorId="5C61E086" wp14:editId="3C8AF442">
             <wp:extent cx="5943600" cy="2546985"/>
             <wp:effectExtent l="0" t="0" r="0" b="5715"/>
-            <wp:docPr id="260427961" name="Picture 1"/>
+            <wp:docPr id="1776528676" name="Picture 1"/>
             <wp:cNvGraphicFramePr>
               <a:graphicFrameLocks xmlns:a="http://schemas.openxmlformats.org/drawingml/2006/main" noChangeAspect="1"/>
             </wp:cNvGraphicFramePr>
@@ -62,7 +48,7 @@
               <a:graphicData uri="http://schemas.openxmlformats.org/drawingml/2006/picture">
                 <pic:pic xmlns:pic="http://schemas.openxmlformats.org/drawingml/2006/picture">
                   <pic:nvPicPr>
-                    <pic:cNvPr id="260427961" name=""/>
+                    <pic:cNvPr id="1776528676" name=""/>
                     <pic:cNvPicPr/>
                   </pic:nvPicPr>
                   <pic:blipFill>
@@ -122,18 +108,25 @@
         </w:rPr>
         <w:t xml:space="preserve"> Confusion matrix</w:t>
       </w:r>
-      <w:r>
-        <w:rPr>
-          <w:rFonts w:ascii="Times New Roman" w:hAnsi="Times New Roman" w:cs="Times New Roman"/>
-          <w:b/>
-          <w:bCs/>
-          <w:lang w:val="en-US"/>
+    </w:p>
+    <w:p>
+      <w:pPr>
+        <w:spacing w:after="0"/>
+        <w:rPr>
+          <w:rFonts w:ascii="Times New Roman" w:hAnsi="Times New Roman" w:cs="Times New Roman"/>
+          <w:noProof/>
+        </w:rPr>
+      </w:pPr>
+      <w:r>
+        <w:rPr>
+          <w:rFonts w:ascii="Times New Roman" w:hAnsi="Times New Roman" w:cs="Times New Roman"/>
+          <w:noProof/>
         </w:rPr>
         <w:drawing>
-          <wp:inline distT="0" distB="0" distL="0" distR="0" wp14:anchorId="33F6E032" wp14:editId="1110F2AB">
+          <wp:inline distT="0" distB="0" distL="0" distR="0" wp14:anchorId="6DBE4786" wp14:editId="52467632">
             <wp:extent cx="5943600" cy="2971800"/>
             <wp:effectExtent l="0" t="0" r="0" b="0"/>
-            <wp:docPr id="1774508872" name="Picture 1"/>
+            <wp:docPr id="1936283843" name="Picture 1"/>
             <wp:cNvGraphicFramePr>
               <a:graphicFrameLocks xmlns:a="http://schemas.openxmlformats.org/drawingml/2006/main" noChangeAspect="1"/>
             </wp:cNvGraphicFramePr>
@@ -141,7 +134,7 @@
               <a:graphicData uri="http://schemas.openxmlformats.org/drawingml/2006/picture">
                 <pic:pic xmlns:pic="http://schemas.openxmlformats.org/drawingml/2006/picture">
                   <pic:nvPicPr>
-                    <pic:cNvPr id="1774508872" name=""/>
+                    <pic:cNvPr id="1936283843" name=""/>
                     <pic:cNvPicPr/>
                   </pic:nvPicPr>
                   <pic:blipFill>
@@ -219,7 +212,28 @@
           <w:rFonts w:ascii="Times New Roman" w:hAnsi="Times New Roman" w:cs="Times New Roman"/>
           <w:lang w:val="en-US"/>
         </w:rPr>
-        <w:t>Strat by doing data augmentation to create more data for the model for better performance. Then, create a U-net encoder-decoder model to process the images. All code is divided by classes to make the main function easy to understand and readable.</w:t>
+        <w:t>Implement data augmentation but set it false to fair comparison with SVM</w:t>
+      </w:r>
+      <w:r>
+        <w:rPr>
+          <w:rFonts w:ascii="Times New Roman" w:hAnsi="Times New Roman" w:cs="Times New Roman"/>
+          <w:lang w:val="en-US"/>
+        </w:rPr>
+        <w:t xml:space="preserve">. </w:t>
+      </w:r>
+      <w:r>
+        <w:rPr>
+          <w:rFonts w:ascii="Times New Roman" w:hAnsi="Times New Roman" w:cs="Times New Roman"/>
+          <w:lang w:val="en-US"/>
+        </w:rPr>
+        <w:t xml:space="preserve">First, we </w:t>
+      </w:r>
+      <w:r>
+        <w:rPr>
+          <w:rFonts w:ascii="Times New Roman" w:hAnsi="Times New Roman" w:cs="Times New Roman"/>
+          <w:lang w:val="en-US"/>
+        </w:rPr>
+        <w:t>create a U-net encoder-decoder model to process the images. All code is divided by classes to make the main function easy to understand and readable.</w:t>
       </w:r>
     </w:p>
     <w:p>
@@ -251,28 +265,7 @@
           <w:rFonts w:ascii="Times New Roman" w:hAnsi="Times New Roman" w:cs="Times New Roman"/>
           <w:lang w:val="en-US"/>
         </w:rPr>
-        <w:t>Accuracy:</w:t>
-      </w:r>
-      <w:r>
-        <w:rPr>
-          <w:rFonts w:ascii="Times New Roman" w:hAnsi="Times New Roman" w:cs="Times New Roman"/>
-          <w:lang w:val="en-US"/>
-        </w:rPr>
-        <w:t xml:space="preserve"> </w:t>
-      </w:r>
-      <w:r>
-        <w:rPr>
-          <w:rFonts w:ascii="Times New Roman" w:hAnsi="Times New Roman" w:cs="Times New Roman"/>
-          <w:lang w:val="en-US"/>
-        </w:rPr>
-        <w:t>0.7943 (</w:t>
-      </w:r>
-      <w:r>
-        <w:rPr>
-          <w:rFonts w:ascii="Times New Roman" w:hAnsi="Times New Roman" w:cs="Times New Roman"/>
-          <w:lang w:val="en-US"/>
-        </w:rPr>
-        <w:t>79.43%)</w:t>
+        <w:t>Accuracy: 0.7943 (79.43%)</w:t>
       </w:r>
     </w:p>
     <w:p>
@@ -288,28 +281,7 @@
           <w:lang w:val="en-US"/>
         </w:rPr>
         <w:lastRenderedPageBreak/>
-        <w:t>Precision:</w:t>
-      </w:r>
-      <w:r>
-        <w:rPr>
-          <w:rFonts w:ascii="Times New Roman" w:hAnsi="Times New Roman" w:cs="Times New Roman"/>
-          <w:lang w:val="en-US"/>
-        </w:rPr>
-        <w:t xml:space="preserve"> </w:t>
-      </w:r>
-      <w:r>
-        <w:rPr>
-          <w:rFonts w:ascii="Times New Roman" w:hAnsi="Times New Roman" w:cs="Times New Roman"/>
-          <w:lang w:val="en-US"/>
-        </w:rPr>
-        <w:t>0.8101 (</w:t>
-      </w:r>
-      <w:r>
-        <w:rPr>
-          <w:rFonts w:ascii="Times New Roman" w:hAnsi="Times New Roman" w:cs="Times New Roman"/>
-          <w:lang w:val="en-US"/>
-        </w:rPr>
-        <w:t>macro avg)</w:t>
+        <w:t>Precision: 0.8101 (macro avg)</w:t>
       </w:r>
     </w:p>
     <w:p>
@@ -324,21 +296,7 @@
           <w:rFonts w:ascii="Times New Roman" w:hAnsi="Times New Roman" w:cs="Times New Roman"/>
           <w:lang w:val="en-US"/>
         </w:rPr>
-        <w:t xml:space="preserve">Recall: </w:t>
-      </w:r>
-      <w:r>
-        <w:rPr>
-          <w:rFonts w:ascii="Times New Roman" w:hAnsi="Times New Roman" w:cs="Times New Roman"/>
-          <w:lang w:val="en-US"/>
-        </w:rPr>
-        <w:t>0.7880 (</w:t>
-      </w:r>
-      <w:r>
-        <w:rPr>
-          <w:rFonts w:ascii="Times New Roman" w:hAnsi="Times New Roman" w:cs="Times New Roman"/>
-          <w:lang w:val="en-US"/>
-        </w:rPr>
-        <w:t>macro avg)</w:t>
+        <w:t>Recall: 0.7880 (macro avg)</w:t>
       </w:r>
     </w:p>
     <w:p>
@@ -367,21 +325,7 @@
           <w:rFonts w:ascii="Times New Roman" w:hAnsi="Times New Roman" w:cs="Times New Roman"/>
           <w:lang w:val="en-US"/>
         </w:rPr>
-        <w:t xml:space="preserve">: </w:t>
-      </w:r>
-      <w:r>
-        <w:rPr>
-          <w:rFonts w:ascii="Times New Roman" w:hAnsi="Times New Roman" w:cs="Times New Roman"/>
-          <w:lang w:val="en-US"/>
-        </w:rPr>
-        <w:t>0.7977 (</w:t>
-      </w:r>
-      <w:r>
-        <w:rPr>
-          <w:rFonts w:ascii="Times New Roman" w:hAnsi="Times New Roman" w:cs="Times New Roman"/>
-          <w:lang w:val="en-US"/>
-        </w:rPr>
-        <w:t>macro avg)</w:t>
+        <w:t>: 0.7977 (macro avg)</w:t>
       </w:r>
     </w:p>
     <w:p>
@@ -409,9 +353,18 @@
       <w:r>
         <w:rPr>
           <w:rFonts w:ascii="Times New Roman" w:hAnsi="Times New Roman" w:cs="Times New Roman"/>
-          <w:lang w:val="en-US"/>
-        </w:rPr>
-        <w:t xml:space="preserve">Table 1. </w:t>
+          <w:b/>
+          <w:bCs/>
+          <w:lang w:val="en-US"/>
+        </w:rPr>
+        <w:t>Table 1.</w:t>
+      </w:r>
+      <w:r>
+        <w:rPr>
+          <w:rFonts w:ascii="Times New Roman" w:hAnsi="Times New Roman" w:cs="Times New Roman"/>
+          <w:lang w:val="en-US"/>
+        </w:rPr>
+        <w:t xml:space="preserve"> </w:t>
       </w:r>
       <w:r>
         <w:rPr>
@@ -566,7 +519,14 @@
                 <w:rFonts w:ascii="Times New Roman" w:hAnsi="Times New Roman" w:cs="Times New Roman"/>
                 <w:lang w:val="en-US"/>
               </w:rPr>
-              <w:t>0.92</w:t>
+              <w:t>0.</w:t>
+            </w:r>
+            <w:r>
+              <w:rPr>
+                <w:rFonts w:ascii="Times New Roman" w:hAnsi="Times New Roman" w:cs="Times New Roman"/>
+                <w:lang w:val="en-US"/>
+              </w:rPr>
+              <w:t>89</w:t>
             </w:r>
           </w:p>
         </w:tc>
@@ -586,7 +546,14 @@
                 <w:rFonts w:ascii="Times New Roman" w:hAnsi="Times New Roman" w:cs="Times New Roman"/>
                 <w:lang w:val="en-US"/>
               </w:rPr>
-              <w:t>0.84</w:t>
+              <w:t>0.8</w:t>
+            </w:r>
+            <w:r>
+              <w:rPr>
+                <w:rFonts w:ascii="Times New Roman" w:hAnsi="Times New Roman" w:cs="Times New Roman"/>
+                <w:lang w:val="en-US"/>
+              </w:rPr>
+              <w:t>2</w:t>
             </w:r>
             <w:r>
               <w:rPr>
@@ -613,7 +580,14 @@
                 <w:rFonts w:ascii="Times New Roman" w:hAnsi="Times New Roman" w:cs="Times New Roman"/>
                 <w:lang w:val="en-US"/>
               </w:rPr>
-              <w:t>0.88</w:t>
+              <w:t>0.8</w:t>
+            </w:r>
+            <w:r>
+              <w:rPr>
+                <w:rFonts w:ascii="Times New Roman" w:hAnsi="Times New Roman" w:cs="Times New Roman"/>
+                <w:lang w:val="en-US"/>
+              </w:rPr>
+              <w:t>6</w:t>
             </w:r>
             <w:r>
               <w:rPr>
@@ -640,7 +614,7 @@
                 <w:rFonts w:ascii="Times New Roman" w:hAnsi="Times New Roman" w:cs="Times New Roman"/>
                 <w:lang w:val="en-US"/>
               </w:rPr>
-              <w:t>197382</w:t>
+              <w:t>158603</w:t>
             </w:r>
           </w:p>
         </w:tc>
@@ -689,7 +663,7 @@
                 <w:rFonts w:ascii="Times New Roman" w:hAnsi="Times New Roman" w:cs="Times New Roman"/>
                 <w:lang w:val="en-US"/>
               </w:rPr>
-              <w:t>78</w:t>
+              <w:t>77</w:t>
             </w:r>
           </w:p>
         </w:tc>
@@ -709,7 +683,14 @@
                 <w:rFonts w:ascii="Times New Roman" w:hAnsi="Times New Roman" w:cs="Times New Roman"/>
                 <w:lang w:val="en-US"/>
               </w:rPr>
-              <w:t>0.69</w:t>
+              <w:t>0.</w:t>
+            </w:r>
+            <w:r>
+              <w:rPr>
+                <w:rFonts w:ascii="Times New Roman" w:hAnsi="Times New Roman" w:cs="Times New Roman"/>
+                <w:lang w:val="en-US"/>
+              </w:rPr>
+              <w:t>76</w:t>
             </w:r>
             <w:r>
               <w:rPr>
@@ -736,7 +717,14 @@
                 <w:rFonts w:ascii="Times New Roman" w:hAnsi="Times New Roman" w:cs="Times New Roman"/>
                 <w:lang w:val="en-US"/>
               </w:rPr>
-              <w:t>0.73</w:t>
+              <w:t>0.7</w:t>
+            </w:r>
+            <w:r>
+              <w:rPr>
+                <w:rFonts w:ascii="Times New Roman" w:hAnsi="Times New Roman" w:cs="Times New Roman"/>
+                <w:lang w:val="en-US"/>
+              </w:rPr>
+              <w:t>6</w:t>
             </w:r>
             <w:r>
               <w:rPr>
@@ -763,7 +751,7 @@
                 <w:rFonts w:ascii="Times New Roman" w:hAnsi="Times New Roman" w:cs="Times New Roman"/>
                 <w:lang w:val="en-US"/>
               </w:rPr>
-              <w:t>303858</w:t>
+              <w:t>312668</w:t>
             </w:r>
           </w:p>
         </w:tc>
@@ -821,7 +809,7 @@
                 <w:rFonts w:ascii="Times New Roman" w:hAnsi="Times New Roman" w:cs="Times New Roman"/>
                 <w:lang w:val="en-US"/>
               </w:rPr>
-              <w:t>71</w:t>
+              <w:t>74</w:t>
             </w:r>
             <w:r>
               <w:rPr>
@@ -848,7 +836,14 @@
                 <w:rFonts w:ascii="Times New Roman" w:hAnsi="Times New Roman" w:cs="Times New Roman"/>
                 <w:lang w:val="en-US"/>
               </w:rPr>
-              <w:t>0.73</w:t>
+              <w:t>0.7</w:t>
+            </w:r>
+            <w:r>
+              <w:rPr>
+                <w:rFonts w:ascii="Times New Roman" w:hAnsi="Times New Roman" w:cs="Times New Roman"/>
+                <w:lang w:val="en-US"/>
+              </w:rPr>
+              <w:t>6</w:t>
             </w:r>
           </w:p>
         </w:tc>
@@ -868,7 +863,14 @@
                 <w:rFonts w:ascii="Times New Roman" w:hAnsi="Times New Roman" w:cs="Times New Roman"/>
                 <w:lang w:val="en-US"/>
               </w:rPr>
-              <w:t>0.72</w:t>
+              <w:t>0.7</w:t>
+            </w:r>
+            <w:r>
+              <w:rPr>
+                <w:rFonts w:ascii="Times New Roman" w:hAnsi="Times New Roman" w:cs="Times New Roman"/>
+                <w:lang w:val="en-US"/>
+              </w:rPr>
+              <w:t>6</w:t>
             </w:r>
             <w:r>
               <w:rPr>
@@ -895,7 +897,7 @@
                 <w:rFonts w:ascii="Times New Roman" w:hAnsi="Times New Roman" w:cs="Times New Roman"/>
                 <w:lang w:val="en-US"/>
               </w:rPr>
-              <w:t>471197</w:t>
+              <w:t>484377</w:t>
             </w:r>
           </w:p>
         </w:tc>
@@ -944,7 +946,14 @@
                 <w:rFonts w:ascii="Times New Roman" w:hAnsi="Times New Roman" w:cs="Times New Roman"/>
                 <w:lang w:val="en-US"/>
               </w:rPr>
-              <w:t>83</w:t>
+              <w:t>8</w:t>
+            </w:r>
+            <w:r>
+              <w:rPr>
+                <w:rFonts w:ascii="Times New Roman" w:hAnsi="Times New Roman" w:cs="Times New Roman"/>
+                <w:lang w:val="en-US"/>
+              </w:rPr>
+              <w:t>7</w:t>
             </w:r>
           </w:p>
         </w:tc>
@@ -964,7 +973,14 @@
                 <w:rFonts w:ascii="Times New Roman" w:hAnsi="Times New Roman" w:cs="Times New Roman"/>
                 <w:lang w:val="en-US"/>
               </w:rPr>
-              <w:t>0.89</w:t>
+              <w:t>0.8</w:t>
+            </w:r>
+            <w:r>
+              <w:rPr>
+                <w:rFonts w:ascii="Times New Roman" w:hAnsi="Times New Roman" w:cs="Times New Roman"/>
+                <w:lang w:val="en-US"/>
+              </w:rPr>
+              <w:t>8</w:t>
             </w:r>
             <w:r>
               <w:rPr>
@@ -998,7 +1014,7 @@
                 <w:rFonts w:ascii="Times New Roman" w:hAnsi="Times New Roman" w:cs="Times New Roman"/>
                 <w:lang w:val="en-US"/>
               </w:rPr>
-              <w:t>6</w:t>
+              <w:t>8</w:t>
             </w:r>
             <w:r>
               <w:rPr>
@@ -1025,7 +1041,7 @@
                 <w:rFonts w:ascii="Times New Roman" w:hAnsi="Times New Roman" w:cs="Times New Roman"/>
                 <w:lang w:val="en-US"/>
               </w:rPr>
-              <w:t>551275</w:t>
+              <w:t>568064</w:t>
             </w:r>
           </w:p>
         </w:tc>
@@ -1068,14 +1084,14 @@
                 <w:rFonts w:ascii="Times New Roman" w:hAnsi="Times New Roman" w:cs="Times New Roman"/>
                 <w:lang w:val="en-US"/>
               </w:rPr>
-              <w:t>0.7</w:t>
-            </w:r>
-            <w:r>
-              <w:rPr>
-                <w:rFonts w:ascii="Times New Roman" w:hAnsi="Times New Roman" w:cs="Times New Roman"/>
-                <w:lang w:val="en-US"/>
-              </w:rPr>
-              <w:t>9</w:t>
+              <w:t>0.</w:t>
+            </w:r>
+            <w:r>
+              <w:rPr>
+                <w:rFonts w:ascii="Times New Roman" w:hAnsi="Times New Roman" w:cs="Times New Roman"/>
+                <w:lang w:val="en-US"/>
+              </w:rPr>
+              <w:t>81</w:t>
             </w:r>
           </w:p>
         </w:tc>
@@ -1208,7 +1224,14 @@
                 <w:rFonts w:ascii="Times New Roman" w:hAnsi="Times New Roman" w:cs="Times New Roman"/>
                 <w:lang w:val="en-US"/>
               </w:rPr>
-              <w:t>0.80</w:t>
+              <w:t>0.8</w:t>
+            </w:r>
+            <w:r>
+              <w:rPr>
+                <w:rFonts w:ascii="Times New Roman" w:hAnsi="Times New Roman" w:cs="Times New Roman"/>
+                <w:lang w:val="en-US"/>
+              </w:rPr>
+              <w:t>1</w:t>
             </w:r>
           </w:p>
         </w:tc>
@@ -1275,21 +1298,7 @@
           <w:rFonts w:ascii="Times New Roman" w:hAnsi="Times New Roman" w:cs="Times New Roman"/>
           <w:lang w:val="en-US"/>
         </w:rPr>
-        <w:t xml:space="preserve">Table </w:t>
-      </w:r>
-      <w:r>
-        <w:rPr>
-          <w:rFonts w:ascii="Times New Roman" w:hAnsi="Times New Roman" w:cs="Times New Roman"/>
-          <w:lang w:val="en-US"/>
-        </w:rPr>
-        <w:t>2</w:t>
-      </w:r>
-      <w:r>
-        <w:rPr>
-          <w:rFonts w:ascii="Times New Roman" w:hAnsi="Times New Roman" w:cs="Times New Roman"/>
-          <w:lang w:val="en-US"/>
-        </w:rPr>
-        <w:t xml:space="preserve">. </w:t>
+        <w:t xml:space="preserve">Table 2. </w:t>
       </w:r>
       <w:r>
         <w:rPr>
@@ -2352,70 +2361,7 @@
           <w:rFonts w:ascii="Times New Roman" w:hAnsi="Times New Roman" w:cs="Times New Roman"/>
           <w:lang w:val="en-US"/>
         </w:rPr>
-        <w:t>However, we implement</w:t>
-      </w:r>
-      <w:r>
-        <w:rPr>
-          <w:rFonts w:ascii="Times New Roman" w:hAnsi="Times New Roman" w:cs="Times New Roman"/>
-          <w:lang w:val="en-US"/>
-        </w:rPr>
-        <w:t xml:space="preserve"> data augmentation </w:t>
-      </w:r>
-      <w:r>
-        <w:rPr>
-          <w:rFonts w:ascii="Times New Roman" w:hAnsi="Times New Roman" w:cs="Times New Roman"/>
-          <w:lang w:val="en-US"/>
-        </w:rPr>
-        <w:t xml:space="preserve">for the deep learning model </w:t>
-      </w:r>
-      <w:r>
-        <w:rPr>
-          <w:rFonts w:ascii="Times New Roman" w:hAnsi="Times New Roman" w:cs="Times New Roman"/>
-          <w:lang w:val="en-US"/>
-        </w:rPr>
-        <w:t>which we can see it in the results</w:t>
-      </w:r>
-      <w:r>
-        <w:rPr>
-          <w:rFonts w:ascii="Times New Roman" w:hAnsi="Times New Roman" w:cs="Times New Roman"/>
-          <w:lang w:val="en-US"/>
-        </w:rPr>
-        <w:t>,</w:t>
-      </w:r>
-      <w:r>
-        <w:rPr>
-          <w:rFonts w:ascii="Times New Roman" w:hAnsi="Times New Roman" w:cs="Times New Roman"/>
-          <w:lang w:val="en-US"/>
-        </w:rPr>
-        <w:t xml:space="preserve"> </w:t>
-      </w:r>
-      <w:r>
-        <w:rPr>
-          <w:rFonts w:ascii="Times New Roman" w:hAnsi="Times New Roman" w:cs="Times New Roman"/>
-          <w:lang w:val="en-US"/>
-        </w:rPr>
-        <w:t xml:space="preserve">getting a </w:t>
-      </w:r>
-      <w:r>
-        <w:rPr>
-          <w:rFonts w:ascii="Times New Roman" w:hAnsi="Times New Roman" w:cs="Times New Roman"/>
-          <w:lang w:val="en-US"/>
-        </w:rPr>
-        <w:t xml:space="preserve">better accuracy with deep learning. Considering that we did not fine tune anything, both models have similar performance, </w:t>
-      </w:r>
-      <w:r>
-        <w:rPr>
-          <w:rFonts w:ascii="Times New Roman" w:hAnsi="Times New Roman" w:cs="Times New Roman"/>
-          <w:lang w:val="en-US"/>
-        </w:rPr>
-        <w:t>however,</w:t>
-      </w:r>
-      <w:r>
-        <w:rPr>
-          <w:rFonts w:ascii="Times New Roman" w:hAnsi="Times New Roman" w:cs="Times New Roman"/>
-          <w:lang w:val="en-US"/>
-        </w:rPr>
-        <w:t xml:space="preserve"> the deep learning model takes more computational power. </w:t>
+        <w:t xml:space="preserve">For the implementation part, the SVM give us more problems when constructing the data set for the model, however, for the neural network, this process was easier because we use torch library to manage that for us. As for the results, considering neither model was fine-tune, the SVM has an accuracy of 75.83%, while the neural network has 81.02%. The neural network worked better when the features are images. </w:t>
       </w:r>
     </w:p>
     <w:sectPr>

</xml_diff>